<commit_message>
feat: add top kader leaderboard to executive dashboard
</commit_message>
<xml_diff>
--- a/docs/EVAL MEET2.docx
+++ b/docs/EVAL MEET2.docx
@@ -5,209 +5,323 @@
     <w:p>
       <w:proofErr w:type="spellStart"/>
       <w:r>
-        <w:t>Pakan</w:t>
-      </w:r>
-      <w:proofErr w:type="spellEnd"/>
-      <w:r>
-        <w:t xml:space="preserve"> </w:t>
-      </w:r>
-      <w:proofErr w:type="spellStart"/>
-      <w:r>
-        <w:t>ternak</w:t>
-      </w:r>
-      <w:proofErr w:type="spellEnd"/>
-      <w:r>
-        <w:t xml:space="preserve"> </w:t>
-      </w:r>
-      <w:proofErr w:type="spellStart"/>
-      <w:r>
-        <w:t>masukan</w:t>
-      </w:r>
-      <w:proofErr w:type="spellEnd"/>
-      <w:r>
-        <w:t xml:space="preserve"> </w:t>
-      </w:r>
-      <w:proofErr w:type="spellStart"/>
-      <w:r>
-        <w:t>jenis</w:t>
-      </w:r>
-      <w:proofErr w:type="spellEnd"/>
-      <w:r>
-        <w:t xml:space="preserve"> </w:t>
-      </w:r>
-      <w:proofErr w:type="spellStart"/>
-      <w:r>
-        <w:t>misal</w:t>
-      </w:r>
-      <w:proofErr w:type="spellEnd"/>
-      <w:r>
-        <w:t xml:space="preserve"> ikan, </w:t>
-      </w:r>
-      <w:proofErr w:type="spellStart"/>
-      <w:r>
-        <w:t>ayam</w:t>
-      </w:r>
-      <w:proofErr w:type="spellEnd"/>
-      <w:r>
-        <w:t xml:space="preserve"> </w:t>
-      </w:r>
-      <w:proofErr w:type="spellStart"/>
-      <w:r>
-        <w:t>dll</w:t>
-      </w:r>
-      <w:proofErr w:type="spellEnd"/>
+        <w:t>Tambahkan</w:t>
+      </w:r>
+      <w:proofErr w:type="spellEnd"/>
+      <w:r>
+        <w:t xml:space="preserve"> item </w:t>
+      </w:r>
+      <w:proofErr w:type="spellStart"/>
+      <w:r>
+        <w:t>pelaporan</w:t>
+      </w:r>
+      <w:proofErr w:type="spellEnd"/>
+      <w:r>
+        <w:t xml:space="preserve"> </w:t>
+      </w:r>
     </w:p>
     <w:p>
       <w:proofErr w:type="spellStart"/>
       <w:r>
-        <w:t>menampilkan</w:t>
-      </w:r>
-      <w:proofErr w:type="spellEnd"/>
-      <w:r>
-        <w:t xml:space="preserve"> </w:t>
-      </w:r>
-      <w:proofErr w:type="spellStart"/>
-      <w:r>
-        <w:t>jumlah</w:t>
-      </w:r>
-      <w:proofErr w:type="spellEnd"/>
-      <w:r>
-        <w:t xml:space="preserve"> </w:t>
-      </w:r>
-      <w:proofErr w:type="spellStart"/>
-      <w:r>
-        <w:t>penduduk</w:t>
-      </w:r>
-      <w:proofErr w:type="spellEnd"/>
-      <w:r>
-        <w:t xml:space="preserve"> yang </w:t>
-      </w:r>
-      <w:proofErr w:type="spellStart"/>
-      <w:r>
-        <w:t>meungkinkan</w:t>
-      </w:r>
-      <w:proofErr w:type="spellEnd"/>
-      <w:r>
-        <w:t xml:space="preserve"> </w:t>
-      </w:r>
-      <w:proofErr w:type="spellStart"/>
-      <w:r>
-        <w:t>potensi</w:t>
-      </w:r>
-      <w:proofErr w:type="spellEnd"/>
-      <w:r>
-        <w:t xml:space="preserve"> </w:t>
-      </w:r>
-      <w:proofErr w:type="spellStart"/>
-      <w:r>
-        <w:t>timbulan</w:t>
-      </w:r>
-      <w:proofErr w:type="spellEnd"/>
-      <w:r>
-        <w:t xml:space="preserve"> </w:t>
-      </w:r>
-      <w:proofErr w:type="spellStart"/>
-      <w:r>
-        <w:t>sampah</w:t>
-      </w:r>
-      <w:proofErr w:type="spellEnd"/>
-      <w:r>
-        <w:t xml:space="preserve">, </w:t>
-      </w:r>
-      <w:proofErr w:type="spellStart"/>
-      <w:r>
-        <w:t>jadi</w:t>
-      </w:r>
-      <w:proofErr w:type="spellEnd"/>
-      <w:r>
-        <w:t xml:space="preserve"> </w:t>
-      </w:r>
-      <w:proofErr w:type="spellStart"/>
-      <w:r>
-        <w:t>setiap</w:t>
-      </w:r>
-      <w:proofErr w:type="spellEnd"/>
-      <w:r>
-        <w:t xml:space="preserve"> </w:t>
-      </w:r>
-      <w:proofErr w:type="spellStart"/>
-      <w:r>
-        <w:t>desa</w:t>
-      </w:r>
-      <w:proofErr w:type="spellEnd"/>
-      <w:r>
-        <w:t xml:space="preserve"> </w:t>
-      </w:r>
-      <w:proofErr w:type="spellStart"/>
-      <w:r>
-        <w:t>mengakumulasi</w:t>
-      </w:r>
-      <w:proofErr w:type="spellEnd"/>
-      <w:r>
-        <w:t xml:space="preserve"> </w:t>
-      </w:r>
-      <w:proofErr w:type="spellStart"/>
-      <w:r>
-        <w:t>kinerja</w:t>
-      </w:r>
-      <w:proofErr w:type="spellEnd"/>
-      <w:r>
-        <w:t xml:space="preserve"> dan </w:t>
-      </w:r>
-      <w:proofErr w:type="spellStart"/>
-      <w:r>
-        <w:t>presentase</w:t>
-      </w:r>
-      <w:proofErr w:type="spellEnd"/>
-      <w:r>
-        <w:t xml:space="preserve"> </w:t>
-      </w:r>
-      <w:proofErr w:type="spellStart"/>
-      <w:r>
-        <w:t>keberhasilan</w:t>
+        <w:t>Pakan</w:t>
+      </w:r>
+      <w:proofErr w:type="spellEnd"/>
+      <w:r>
+        <w:t xml:space="preserve"> </w:t>
+      </w:r>
+      <w:proofErr w:type="spellStart"/>
+      <w:r>
+        <w:t>ternak</w:t>
+      </w:r>
+      <w:proofErr w:type="spellEnd"/>
+      <w:r>
+        <w:t xml:space="preserve"> </w:t>
+      </w:r>
+      <w:proofErr w:type="spellStart"/>
+      <w:r>
+        <w:t>masukan</w:t>
+      </w:r>
+      <w:proofErr w:type="spellEnd"/>
+      <w:r>
+        <w:t xml:space="preserve"> </w:t>
+      </w:r>
+      <w:proofErr w:type="spellStart"/>
+      <w:r>
+        <w:t>jenis</w:t>
+      </w:r>
+      <w:proofErr w:type="spellEnd"/>
+      <w:r>
+        <w:t xml:space="preserve"> </w:t>
+      </w:r>
+      <w:proofErr w:type="spellStart"/>
+      <w:r>
+        <w:t>misal</w:t>
+      </w:r>
+      <w:proofErr w:type="spellEnd"/>
+      <w:r>
+        <w:t xml:space="preserve"> ikan, </w:t>
+      </w:r>
+      <w:proofErr w:type="spellStart"/>
+      <w:r>
+        <w:t>ayam</w:t>
+      </w:r>
+      <w:proofErr w:type="spellEnd"/>
+      <w:r>
+        <w:t xml:space="preserve"> </w:t>
+      </w:r>
+      <w:proofErr w:type="spellStart"/>
+      <w:r>
+        <w:t>dll</w:t>
       </w:r>
       <w:proofErr w:type="spellEnd"/>
     </w:p>
     <w:p>
-      <w:proofErr w:type="spellStart"/>
-      <w:r>
-        <w:t>kader</w:t>
-      </w:r>
-      <w:proofErr w:type="spellEnd"/>
-      <w:r>
-        <w:t xml:space="preserve"> yang paling </w:t>
-      </w:r>
-      <w:proofErr w:type="spellStart"/>
-      <w:r>
-        <w:t>banyak</w:t>
-      </w:r>
-      <w:proofErr w:type="spellEnd"/>
-      <w:r>
-        <w:t xml:space="preserve"> </w:t>
-      </w:r>
-      <w:proofErr w:type="spellStart"/>
-      <w:r>
-        <w:t>siapa</w:t>
+      <w:pPr>
+        <w:rPr>
+          <w:b/>
+          <w:bCs/>
+        </w:rPr>
+      </w:pPr>
+      <w:proofErr w:type="spellStart"/>
+      <w:r>
+        <w:rPr>
+          <w:b/>
+          <w:bCs/>
+        </w:rPr>
+        <w:t>menampilkan</w:t>
+      </w:r>
+      <w:proofErr w:type="spellEnd"/>
+      <w:r>
+        <w:rPr>
+          <w:b/>
+          <w:bCs/>
+        </w:rPr>
+        <w:t xml:space="preserve"> </w:t>
+      </w:r>
+      <w:proofErr w:type="spellStart"/>
+      <w:r>
+        <w:rPr>
+          <w:b/>
+          <w:bCs/>
+        </w:rPr>
+        <w:t>jumlah</w:t>
+      </w:r>
+      <w:proofErr w:type="spellEnd"/>
+      <w:r>
+        <w:rPr>
+          <w:b/>
+          <w:bCs/>
+        </w:rPr>
+        <w:t xml:space="preserve"> </w:t>
+      </w:r>
+      <w:proofErr w:type="spellStart"/>
+      <w:r>
+        <w:rPr>
+          <w:b/>
+          <w:bCs/>
+        </w:rPr>
+        <w:t>penduduk</w:t>
+      </w:r>
+      <w:proofErr w:type="spellEnd"/>
+      <w:r>
+        <w:rPr>
+          <w:b/>
+          <w:bCs/>
+        </w:rPr>
+        <w:t xml:space="preserve"> yang </w:t>
+      </w:r>
+      <w:proofErr w:type="spellStart"/>
+      <w:r>
+        <w:rPr>
+          <w:b/>
+          <w:bCs/>
+        </w:rPr>
+        <w:t>meungkinkan</w:t>
+      </w:r>
+      <w:proofErr w:type="spellEnd"/>
+      <w:r>
+        <w:rPr>
+          <w:b/>
+          <w:bCs/>
+        </w:rPr>
+        <w:t xml:space="preserve"> </w:t>
+      </w:r>
+      <w:proofErr w:type="spellStart"/>
+      <w:r>
+        <w:rPr>
+          <w:b/>
+          <w:bCs/>
+        </w:rPr>
+        <w:t>potensi</w:t>
+      </w:r>
+      <w:proofErr w:type="spellEnd"/>
+      <w:r>
+        <w:rPr>
+          <w:b/>
+          <w:bCs/>
+        </w:rPr>
+        <w:t xml:space="preserve"> </w:t>
+      </w:r>
+      <w:proofErr w:type="spellStart"/>
+      <w:r>
+        <w:rPr>
+          <w:b/>
+          <w:bCs/>
+        </w:rPr>
+        <w:t>timbulan</w:t>
+      </w:r>
+      <w:proofErr w:type="spellEnd"/>
+      <w:r>
+        <w:rPr>
+          <w:b/>
+          <w:bCs/>
+        </w:rPr>
+        <w:t xml:space="preserve"> </w:t>
+      </w:r>
+      <w:proofErr w:type="spellStart"/>
+      <w:r>
+        <w:rPr>
+          <w:b/>
+          <w:bCs/>
+        </w:rPr>
+        <w:t>sampah</w:t>
+      </w:r>
+      <w:proofErr w:type="spellEnd"/>
+      <w:r>
+        <w:rPr>
+          <w:b/>
+          <w:bCs/>
+        </w:rPr>
+        <w:t xml:space="preserve">, </w:t>
+      </w:r>
+      <w:proofErr w:type="spellStart"/>
+      <w:r>
+        <w:rPr>
+          <w:b/>
+          <w:bCs/>
+        </w:rPr>
+        <w:t>jadi</w:t>
+      </w:r>
+      <w:proofErr w:type="spellEnd"/>
+      <w:r>
+        <w:rPr>
+          <w:b/>
+          <w:bCs/>
+        </w:rPr>
+        <w:t xml:space="preserve"> </w:t>
+      </w:r>
+      <w:proofErr w:type="spellStart"/>
+      <w:r>
+        <w:rPr>
+          <w:b/>
+          <w:bCs/>
+        </w:rPr>
+        <w:t>setiap</w:t>
+      </w:r>
+      <w:proofErr w:type="spellEnd"/>
+      <w:r>
+        <w:rPr>
+          <w:b/>
+          <w:bCs/>
+        </w:rPr>
+        <w:t xml:space="preserve"> </w:t>
+      </w:r>
+      <w:proofErr w:type="spellStart"/>
+      <w:r>
+        <w:rPr>
+          <w:b/>
+          <w:bCs/>
+        </w:rPr>
+        <w:t>desa</w:t>
+      </w:r>
+      <w:proofErr w:type="spellEnd"/>
+      <w:r>
+        <w:rPr>
+          <w:b/>
+          <w:bCs/>
+        </w:rPr>
+        <w:t xml:space="preserve"> </w:t>
+      </w:r>
+      <w:proofErr w:type="spellStart"/>
+      <w:r>
+        <w:rPr>
+          <w:b/>
+          <w:bCs/>
+        </w:rPr>
+        <w:t>mengakumulasi</w:t>
+      </w:r>
+      <w:proofErr w:type="spellEnd"/>
+      <w:r>
+        <w:rPr>
+          <w:b/>
+          <w:bCs/>
+        </w:rPr>
+        <w:t xml:space="preserve"> </w:t>
+      </w:r>
+      <w:proofErr w:type="spellStart"/>
+      <w:r>
+        <w:rPr>
+          <w:b/>
+          <w:bCs/>
+        </w:rPr>
+        <w:t>kinerja</w:t>
+      </w:r>
+      <w:proofErr w:type="spellEnd"/>
+      <w:r>
+        <w:rPr>
+          <w:b/>
+          <w:bCs/>
+        </w:rPr>
+        <w:t xml:space="preserve"> dan </w:t>
+      </w:r>
+      <w:proofErr w:type="spellStart"/>
+      <w:r>
+        <w:rPr>
+          <w:b/>
+          <w:bCs/>
+        </w:rPr>
+        <w:t>presentase</w:t>
+      </w:r>
+      <w:proofErr w:type="spellEnd"/>
+      <w:r>
+        <w:rPr>
+          <w:b/>
+          <w:bCs/>
+        </w:rPr>
+        <w:t xml:space="preserve"> </w:t>
+      </w:r>
+      <w:proofErr w:type="spellStart"/>
+      <w:r>
+        <w:rPr>
+          <w:b/>
+          <w:bCs/>
+        </w:rPr>
+        <w:t>keberhasilan</w:t>
       </w:r>
       <w:proofErr w:type="spellEnd"/>
     </w:p>
     <w:p>
       <w:proofErr w:type="spellStart"/>
       <w:r>
-        <w:t>Tambahkan</w:t>
-      </w:r>
-      <w:proofErr w:type="spellEnd"/>
-      <w:r>
-        <w:t xml:space="preserve"> item </w:t>
-      </w:r>
-      <w:proofErr w:type="spellStart"/>
-      <w:r>
-        <w:t>pelaporan</w:t>
-      </w:r>
-      <w:proofErr w:type="spellEnd"/>
-      <w:r>
-        <w:t xml:space="preserve"> </w:t>
-      </w:r>
+        <w:t>kader</w:t>
+      </w:r>
+      <w:proofErr w:type="spellEnd"/>
+      <w:r>
+        <w:t xml:space="preserve"> yang paling </w:t>
+      </w:r>
+      <w:proofErr w:type="spellStart"/>
+      <w:r>
+        <w:t>banyak</w:t>
+      </w:r>
+      <w:proofErr w:type="spellEnd"/>
+      <w:r>
+        <w:t xml:space="preserve"> </w:t>
+      </w:r>
+      <w:proofErr w:type="spellStart"/>
+      <w:r>
+        <w:t>siapa</w:t>
+      </w:r>
+      <w:proofErr w:type="spellEnd"/>
     </w:p>
     <w:p>
       <w:proofErr w:type="spellStart"/>

</xml_diff>